<commit_message>
Troca o case da semana 1 pelo FemVest (neobroker) e refaz o setorial
- Case 01 passa a ser o FemVest, adaptado do case publico da Roland Berger no
  PrepLounge, com contexto reescrito e anexos de premissas proprios
- Premissas do Anexo A trocadas por um conjunto do CCU: os resultados nao
  coincidem com a versao original, entao resolucao achada na internet nao bate
- Relatorio setorial de neobrokers com dado real e fonte: fim do PFOF na UE em
  1o de julho de 2026, benchmarks de Trade Republic e Scalable, receita do setor
  e gender investment gap
- Gabarito conferido por script: 134.004 clientes, receita de 5,44 mi, ARPU de
  40,60, prejuizo de 2,96 mi no ano 5, equilibrio em 206.897 clientes
- Case de varejo e seu setorial movidos para banco-de-cases, prontos p/ semana 2
</commit_message>
<xml_diff>
--- a/ciclo-de-cases/semana-01/Template de entrega - Case 01.docx
+++ b/ciclo-de-cases/semana-01/Template de entrega - Case 01.docx
@@ -10,14 +10,14 @@
         <w:rPr>
           <w:b/>
           <w:color w:val="C1272D"/>
-          <w:sz w:val="44"/>
+          <w:sz w:val="42"/>
         </w:rPr>
         <w:t>Template de entrega</w:t>
       </w:r>
     </w:p>
     <w:p>
       <w:pPr>
-        <w:spacing w:after="200"/>
+        <w:spacing w:after="180"/>
       </w:pPr>
       <w:r>
         <w:rPr>
@@ -25,7 +25,7 @@
           <w:color w:val="475569"/>
           <w:sz w:val="19"/>
         </w:rPr>
-        <w:t>Case 01, Rede Verdemar  ·  máximo 5 slides ou 2 páginas, incluindo capa</w:t>
+        <w:t>Case 01, FemVest  ·  máximo 5 slides ou 2 páginas, incluindo capa</w:t>
       </w:r>
     </w:p>
     <w:tbl>
@@ -36,8 +36,8 @@
         <w:tblLook w:firstColumn="1" w:firstRow="1" w:lastColumn="0" w:lastRow="0" w:noHBand="0" w:noVBand="1" w:val="04A0"/>
       </w:tblPr>
       <w:tblGrid>
-        <w:gridCol w:w="5100"/>
-        <w:gridCol w:w="5100"/>
+        <w:gridCol w:w="5156"/>
+        <w:gridCol w:w="5156"/>
       </w:tblGrid>
       <w:tr>
         <w:tc>
@@ -121,7 +121,7 @@
     </w:p>
     <w:p>
       <w:pPr>
-        <w:spacing w:before="240" w:after="80"/>
+        <w:spacing w:before="220" w:after="80"/>
         <w:pBdr>
           <w:bottom w:val="single" w:sz="6" w:color="C1272D"/>
         </w:pBdr>
@@ -130,7 +130,7 @@
         <w:rPr>
           <w:b/>
           <w:color w:val="C1272D"/>
-          <w:sz w:val="25"/>
+          <w:sz w:val="24"/>
         </w:rPr>
         <w:t>Recomendação em uma frase</w:t>
       </w:r>
@@ -146,7 +146,7 @@
           <w:color w:val="475569"/>
           <w:sz w:val="18"/>
         </w:rPr>
-        <w:t>Escreva aqui a recomendação com o número que a sustenta. Se ela não couber em uma frase, ela ainda não está pronta.</w:t>
+        <w:t>A recomendação com o número que a sustenta. Se não couber em uma frase, ainda não está pronta.</w:t>
       </w:r>
     </w:p>
     <w:p>
@@ -158,7 +158,7 @@
           <w:b w:val="0"/>
           <w:i w:val="0"/>
           <w:color w:val="1E293B"/>
-          <w:sz w:val="21"/>
+          <w:sz w:val="20"/>
         </w:rPr>
       </w:r>
     </w:p>
@@ -171,13 +171,13 @@
           <w:b w:val="0"/>
           <w:i w:val="0"/>
           <w:color w:val="1E293B"/>
-          <w:sz w:val="21"/>
+          <w:sz w:val="20"/>
         </w:rPr>
       </w:r>
     </w:p>
     <w:p>
       <w:pPr>
-        <w:spacing w:before="240" w:after="80"/>
+        <w:spacing w:before="220" w:after="80"/>
         <w:pBdr>
           <w:bottom w:val="single" w:sz="6" w:color="C1272D"/>
         </w:pBdr>
@@ -186,9 +186,9 @@
         <w:rPr>
           <w:b/>
           <w:color w:val="C1272D"/>
-          <w:sz w:val="25"/>
+          <w:sz w:val="24"/>
         </w:rPr>
-        <w:t>1. Diagnóstico</w:t>
+        <w:t>1. Diagnóstico e tamanho da oportunidade</w:t>
       </w:r>
     </w:p>
     <w:p>
@@ -202,7 +202,7 @@
           <w:color w:val="475569"/>
           <w:sz w:val="18"/>
         </w:rPr>
-        <w:t>Onde está o dinheiro hoje e onde ele está sendo destruído. Mostre o resultado por loja e diga qual critério vocês adotaram para o custo corporativo.</w:t>
+        <w:t>A cadeia do dimensionamento, de população até clientes no ano 5, com a receita e o ARPU. Deixe cada filtro visível.</w:t>
       </w:r>
     </w:p>
     <w:p>
@@ -214,7 +214,7 @@
           <w:b w:val="0"/>
           <w:i w:val="0"/>
           <w:color w:val="1E293B"/>
-          <w:sz w:val="21"/>
+          <w:sz w:val="20"/>
         </w:rPr>
       </w:r>
     </w:p>
@@ -227,7 +227,7 @@
           <w:b w:val="0"/>
           <w:i w:val="0"/>
           <w:color w:val="1E293B"/>
-          <w:sz w:val="21"/>
+          <w:sz w:val="20"/>
         </w:rPr>
       </w:r>
     </w:p>
@@ -240,7 +240,7 @@
           <w:b w:val="0"/>
           <w:i w:val="0"/>
           <w:color w:val="1E293B"/>
-          <w:sz w:val="21"/>
+          <w:sz w:val="20"/>
         </w:rPr>
       </w:r>
     </w:p>
@@ -253,13 +253,13 @@
           <w:b w:val="0"/>
           <w:i w:val="0"/>
           <w:color w:val="1E293B"/>
-          <w:sz w:val="21"/>
+          <w:sz w:val="20"/>
         </w:rPr>
       </w:r>
     </w:p>
     <w:p>
       <w:pPr>
-        <w:spacing w:before="240" w:after="80"/>
+        <w:spacing w:before="220" w:after="80"/>
         <w:pBdr>
           <w:bottom w:val="single" w:sz="6" w:color="C1272D"/>
         </w:pBdr>
@@ -268,9 +268,9 @@
         <w:rPr>
           <w:b/>
           <w:color w:val="C1272D"/>
-          <w:sz w:val="25"/>
+          <w:sz w:val="24"/>
         </w:rPr>
-        <w:t>2. Estratégia</w:t>
+        <w:t>2. Estratégia: segmento, proposta e modelo de receita</w:t>
       </w:r>
     </w:p>
     <w:p>
@@ -284,7 +284,7 @@
           <w:color w:val="475569"/>
           <w:sz w:val="18"/>
         </w:rPr>
-        <w:t>O que fazer, em ordem de prioridade, e o que vocês descartaram. Alternativa descartada sem justificativa escrita não conta como análise de alternativa.</w:t>
+        <w:t>Qual segmento, qual proposta de valor e de onde vem cada euro de receita sem PFOF. Diga o que descartou e por quê.</w:t>
       </w:r>
     </w:p>
     <w:p>
@@ -296,7 +296,7 @@
           <w:b w:val="0"/>
           <w:i w:val="0"/>
           <w:color w:val="1E293B"/>
-          <w:sz w:val="21"/>
+          <w:sz w:val="20"/>
         </w:rPr>
       </w:r>
     </w:p>
@@ -309,7 +309,7 @@
           <w:b w:val="0"/>
           <w:i w:val="0"/>
           <w:color w:val="1E293B"/>
-          <w:sz w:val="21"/>
+          <w:sz w:val="20"/>
         </w:rPr>
       </w:r>
     </w:p>
@@ -322,7 +322,7 @@
           <w:b w:val="0"/>
           <w:i w:val="0"/>
           <w:color w:val="1E293B"/>
-          <w:sz w:val="21"/>
+          <w:sz w:val="20"/>
         </w:rPr>
       </w:r>
     </w:p>
@@ -335,13 +335,13 @@
           <w:b w:val="0"/>
           <w:i w:val="0"/>
           <w:color w:val="1E293B"/>
-          <w:sz w:val="21"/>
+          <w:sz w:val="20"/>
         </w:rPr>
       </w:r>
     </w:p>
     <w:p>
       <w:pPr>
-        <w:spacing w:before="240" w:after="80"/>
+        <w:spacing w:before="220" w:after="80"/>
         <w:pBdr>
           <w:bottom w:val="single" w:sz="6" w:color="C1272D"/>
         </w:pBdr>
@@ -350,9 +350,9 @@
         <w:rPr>
           <w:b/>
           <w:color w:val="C1272D"/>
-          <w:sz w:val="25"/>
+          <w:sz w:val="24"/>
         </w:rPr>
-        <w:t>3. Finanças</w:t>
+        <w:t>3. Finanças: a conta fecha?</w:t>
       </w:r>
     </w:p>
     <w:p>
@@ -366,7 +366,7 @@
           <w:color w:val="475569"/>
           <w:sz w:val="18"/>
         </w:rPr>
-        <w:t>Os números que sustentam a recomendação, com a memória de cálculo visível. Separe o efeito do primeiro ano do efeito recorrente.</w:t>
+        <w:t>Resultado no ano 5, ponto de equilíbrio em clientes e em ARPU, e o patrimônio por cliente que isso exige. Memória de cálculo visível.</w:t>
       </w:r>
     </w:p>
     <w:p>
@@ -378,7 +378,7 @@
           <w:b w:val="0"/>
           <w:i w:val="0"/>
           <w:color w:val="1E293B"/>
-          <w:sz w:val="21"/>
+          <w:sz w:val="20"/>
         </w:rPr>
       </w:r>
     </w:p>
@@ -391,7 +391,7 @@
           <w:b w:val="0"/>
           <w:i w:val="0"/>
           <w:color w:val="1E293B"/>
-          <w:sz w:val="21"/>
+          <w:sz w:val="20"/>
         </w:rPr>
       </w:r>
     </w:p>
@@ -404,7 +404,7 @@
           <w:b w:val="0"/>
           <w:i w:val="0"/>
           <w:color w:val="1E293B"/>
-          <w:sz w:val="21"/>
+          <w:sz w:val="20"/>
         </w:rPr>
       </w:r>
     </w:p>
@@ -417,13 +417,13 @@
           <w:b w:val="0"/>
           <w:i w:val="0"/>
           <w:color w:val="1E293B"/>
-          <w:sz w:val="21"/>
+          <w:sz w:val="20"/>
         </w:rPr>
       </w:r>
     </w:p>
     <w:p>
       <w:pPr>
-        <w:spacing w:before="240" w:after="80"/>
+        <w:spacing w:before="220" w:after="80"/>
         <w:pBdr>
           <w:bottom w:val="single" w:sz="6" w:color="C1272D"/>
         </w:pBdr>
@@ -432,9 +432,9 @@
         <w:rPr>
           <w:b/>
           <w:color w:val="C1272D"/>
-          <w:sz w:val="25"/>
+          <w:sz w:val="24"/>
         </w:rPr>
-        <w:t>4. Riscos e próximos passos</w:t>
+        <w:t>4. Entrada, riscos e próximos passos</w:t>
       </w:r>
     </w:p>
     <w:p>
@@ -448,7 +448,7 @@
           <w:color w:val="475569"/>
           <w:sz w:val="18"/>
         </w:rPr>
-        <w:t>Três riscos da recomendação de vocês, com mitigação, e o que fazer nos primeiros 90 dias. Risco genérico como crise ou concorrência não pontua.</w:t>
+        <w:t>Plano dos primeiros 12 meses, três riscos com mitigação e os próximos passos. Risco genérico como concorrência ou crise não pontua.</w:t>
       </w:r>
     </w:p>
     <w:p>
@@ -460,7 +460,7 @@
           <w:b w:val="0"/>
           <w:i w:val="0"/>
           <w:color w:val="1E293B"/>
-          <w:sz w:val="21"/>
+          <w:sz w:val="20"/>
         </w:rPr>
       </w:r>
     </w:p>
@@ -473,7 +473,7 @@
           <w:b w:val="0"/>
           <w:i w:val="0"/>
           <w:color w:val="1E293B"/>
-          <w:sz w:val="21"/>
+          <w:sz w:val="20"/>
         </w:rPr>
       </w:r>
     </w:p>
@@ -486,13 +486,13 @@
           <w:b w:val="0"/>
           <w:i w:val="0"/>
           <w:color w:val="1E293B"/>
-          <w:sz w:val="21"/>
+          <w:sz w:val="20"/>
         </w:rPr>
       </w:r>
     </w:p>
     <w:p>
       <w:pPr>
-        <w:spacing w:before="240" w:after="80"/>
+        <w:spacing w:before="220" w:after="80"/>
         <w:pBdr>
           <w:bottom w:val="single" w:sz="6" w:color="C1272D"/>
         </w:pBdr>
@@ -501,7 +501,7 @@
         <w:rPr>
           <w:b/>
           <w:color w:val="C1272D"/>
-          <w:sz w:val="25"/>
+          <w:sz w:val="24"/>
         </w:rPr>
         <w:t>Antes de enviar, confira</w:t>
       </w:r>
@@ -509,12 +509,12 @@
     <w:p>
       <w:pPr>
         <w:pStyle w:val="ListBullet"/>
-        <w:spacing w:after="60"/>
+        <w:spacing w:after="40"/>
       </w:pPr>
       <w:r>
         <w:rPr>
           <w:color w:val="1E293B"/>
-          <w:sz w:val="21"/>
+          <w:sz w:val="20"/>
         </w:rPr>
         <w:t>A recomendação está na primeira página ou no primeiro slide, com número.</w:t>
       </w:r>
@@ -522,38 +522,38 @@
     <w:p>
       <w:pPr>
         <w:pStyle w:val="ListBullet"/>
-        <w:spacing w:after="60"/>
+        <w:spacing w:after="40"/>
       </w:pPr>
       <w:r>
         <w:rPr>
           <w:color w:val="1E293B"/>
-          <w:sz w:val="21"/>
+          <w:sz w:val="20"/>
         </w:rPr>
-        <w:t>A memória de cálculo dos números principais está visível.</w:t>
+        <w:t>A cadeia do dimensionamento está visível, filtro por filtro.</w:t>
       </w:r>
     </w:p>
     <w:p>
       <w:pPr>
         <w:pStyle w:val="ListBullet"/>
-        <w:spacing w:after="60"/>
+        <w:spacing w:after="40"/>
       </w:pPr>
       <w:r>
         <w:rPr>
           <w:color w:val="1E293B"/>
-          <w:sz w:val="21"/>
+          <w:sz w:val="20"/>
         </w:rPr>
-        <w:t>O critério do custo corporativo está declarado por escrito.</w:t>
+        <w:t>O modelo de receita não depende de PFOF.</w:t>
       </w:r>
     </w:p>
     <w:p>
       <w:pPr>
         <w:pStyle w:val="ListBullet"/>
-        <w:spacing w:after="60"/>
+        <w:spacing w:after="40"/>
       </w:pPr>
       <w:r>
         <w:rPr>
           <w:color w:val="1E293B"/>
-          <w:sz w:val="21"/>
+          <w:sz w:val="20"/>
         </w:rPr>
         <w:t>Está dentro de 5 slides ou 2 páginas.</w:t>
       </w:r>
@@ -561,12 +561,12 @@
     <w:p>
       <w:pPr>
         <w:pStyle w:val="ListBullet"/>
-        <w:spacing w:after="60"/>
+        <w:spacing w:after="40"/>
       </w:pPr>
       <w:r>
         <w:rPr>
           <w:color w:val="1E293B"/>
-          <w:sz w:val="21"/>
+          <w:sz w:val="20"/>
         </w:rPr>
         <w:t>Vocês conferiram se todos os números do enunciado fecham entre si.</w:t>
       </w:r>
@@ -575,7 +575,7 @@
       <w:headerReference w:type="default" r:id="rId9"/>
       <w:footerReference w:type="default" r:id="rId10"/>
       <w:pgSz w:w="12240" w:h="15840"/>
-      <w:pgMar w:top="737" w:right="1020" w:bottom="737" w:left="1020" w:header="720" w:footer="720" w:gutter="0"/>
+      <w:pgMar w:top="737" w:right="964" w:bottom="737" w:left="964" w:header="720" w:footer="720" w:gutter="0"/>
       <w:cols w:space="720"/>
       <w:docGrid w:linePitch="360"/>
     </w:sectPr>
@@ -594,7 +594,7 @@
         <w:color w:val="475569"/>
         <w:sz w:val="16"/>
       </w:rPr>
-      <w:t>Clube de Consultoria Universitário  ·  dados fictícios, para fins de treinamento</w:t>
+      <w:t>Clube de Consultoria Universitário  ·  Diretoria de Gestão de Pessoas</w:t>
     </w:r>
   </w:p>
 </w:ftr>
@@ -606,7 +606,7 @@
     <w:pPr>
       <w:pStyle w:val="Header"/>
       <w:tabs>
-        <w:tab w:pos="9865" w:val="right"/>
+        <w:tab w:pos="9978" w:val="right"/>
       </w:tabs>
     </w:pPr>
     <w:r>
@@ -1020,12 +1020,12 @@
     <w:qFormat/>
     <w:rsid w:val="00FC693F"/>
     <w:pPr>
-      <w:spacing w:after="120"/>
+      <w:spacing w:after="100"/>
     </w:pPr>
     <w:rPr>
       <w:rFonts w:ascii="Calibri" w:hAnsi="Calibri"/>
       <w:color w:val="1E293B"/>
-      <w:sz w:val="21"/>
+      <w:sz w:val="20"/>
     </w:rPr>
   </w:style>
   <w:style w:type="paragraph" w:styleId="Header">

</xml_diff>